<commit_message>
refactor: 收敛 Python 工具到 backend/tools 并精简冗余; 修复 md2docx 编码
</commit_message>
<xml_diff>
--- a/backend/docs/接口设计表.docx
+++ b/backend/docs/接口设计表.docx
@@ -23,7 +23,7 @@
           <w:b w:val="0"/>
           <w:sz w:val="21"/>
         </w:rPr>
-        <w:t>&gt; 系统: 基于Prompt工程的上市公司财报解读与行业对标系统</w:t>
+        <w:t>&gt; 系统: 基于Prompt工程的listed_company财报解读与industry_benchmark系统</w:t>
       </w:r>
     </w:p>
     <w:p>
@@ -823,7 +823,7 @@
           <w:color w:val="1F3B63"/>
           <w:sz w:val="24"/>
         </w:rPr>
-        <w:t>1.6 行业对标(核心)</w:t>
+        <w:t>1.6 industry_benchmark(核心)</w:t>
       </w:r>
     </w:p>
     <w:p>
@@ -1172,7 +1172,7 @@
           <w:color w:val="1F3B63"/>
           <w:sz w:val="24"/>
         </w:rPr>
-        <w:t>1.9 重算指标与行业对标</w:t>
+        <w:t>1.9 重算指标与industry_benchmark</w:t>
       </w:r>
     </w:p>
     <w:p>
@@ -1231,7 +1231,7 @@
           <w:b w:val="0"/>
           <w:sz w:val="21"/>
         </w:rPr>
-        <w:t>流程: 原始数据 → 指标计算引擎(12项) → 行业对标统计引擎(均值/中位数/标准差/P25/P75)</w:t>
+        <w:t>流程: 原始数据 → 指标计算引擎(12项) → industry_benchmark统计引擎(均值/中位数/标准差/P25/P75)</w:t>
       </w:r>
     </w:p>
     <w:p>
@@ -1328,7 +1328,7 @@
           <w:b w:val="0"/>
           <w:sz w:val="21"/>
         </w:rPr>
-        <w:t>流程: 取行业对标数据 → 序列化为数据上下文 JSON → 组装三层 Prompt</w:t>
+        <w:t>流程: 取industry_benchmark数据 → 序列化为数据上下文 JSON → 组装三层 Prompt</w:t>
       </w:r>
     </w:p>
     <w:p>
@@ -1858,7 +1858,7 @@
                 <w:b w:val="0"/>
                 <w:sz w:val="21"/>
               </w:rPr>
-              <w:t>行业对标数据未找到</w:t>
+              <w:t>industry_benchmark数据未找到</w:t>
             </w:r>
           </w:p>
         </w:tc>
@@ -1994,7 +1994,7 @@
                 <w:b w:val="0"/>
                 <w:sz w:val="21"/>
               </w:rPr>
-              <w:t>提示词模板未找到</w:t>
+              <w:t>prompt_template未找到</w:t>
             </w:r>
           </w:p>
         </w:tc>

</xml_diff>